<commit_message>
Uskladjena terminologija za puls i srcani ritam
</commit_message>
<xml_diff>
--- a/radovi/NadaZaric_R215_RadZaZbornik_v1_Komentari.docx
+++ b/radovi/NadaZaric_R215_RadZaZbornik_v1_Komentari.docx
@@ -180,6 +180,7 @@
         </w:rPr>
       </w:pPr>
       <w:commentRangeStart w:id="0"/>
+      <w:commentRangeStart w:id="1"/>
       <w:r>
         <w:rPr>
           <w:noProof/>
@@ -198,6 +199,17 @@
         </w:rPr>
         <w:commentReference w:id="0"/>
       </w:r>
+      <w:commentRangeEnd w:id="1"/>
+      <w:r>
+        <w:rPr>
+          <w:rStyle w:val="CommentReference"/>
+          <w:noProof/>
+          <w:sz w:val="28"/>
+          <w:szCs w:val="24"/>
+          <w:lang w:val="sr-Cyrl-RS"/>
+        </w:rPr>
+        <w:commentReference w:id="1"/>
+      </w:r>
     </w:p>
     <w:p>
       <w:pPr>
@@ -220,7 +232,8 @@
           <w:lang w:val="sr-Latn-RS"/>
         </w:rPr>
       </w:pPr>
-      <w:commentRangeStart w:id="1"/>
+      <w:commentRangeStart w:id="2"/>
+      <w:commentRangeStart w:id="3"/>
       <w:r>
         <w:rPr>
           <w:i/>
@@ -230,7 +243,7 @@
         </w:rPr>
         <w:t>Title</w:t>
       </w:r>
-      <w:commentRangeEnd w:id="1"/>
+      <w:commentRangeEnd w:id="2"/>
       <w:r>
         <w:rPr>
           <w:rStyle w:val="CommentReference"/>
@@ -241,7 +254,20 @@
           <w:szCs w:val="24"/>
           <w:lang w:val="sr-Latn-RS"/>
         </w:rPr>
-        <w:commentReference w:id="1"/>
+        <w:commentReference w:id="2"/>
+      </w:r>
+      <w:commentRangeEnd w:id="3"/>
+      <w:r>
+        <w:rPr>
+          <w:rStyle w:val="CommentReference"/>
+          <w:i/>
+          <w:iCs w:val="0"/>
+          <w:noProof/>
+          <w:sz w:val="28"/>
+          <w:szCs w:val="24"/>
+          <w:lang w:val="sr-Latn-RS"/>
+        </w:rPr>
+        <w:commentReference w:id="3"/>
       </w:r>
     </w:p>
     <w:p>
@@ -419,8 +445,8 @@
         </w:rPr>
         <w:t xml:space="preserve">фотоплетизмографија, паметни сат, </w:t>
       </w:r>
-      <w:commentRangeStart w:id="2"/>
-      <w:commentRangeStart w:id="3"/>
+      <w:commentRangeStart w:id="4"/>
+      <w:commentRangeStart w:id="5"/>
       <w:r>
         <w:rPr>
           <w:rStyle w:val="7-SadrajapstraktaikljunihreiChar"/>
@@ -431,7 +457,7 @@
         </w:rPr>
         <w:t>биолошка повратна информација</w:t>
       </w:r>
-      <w:commentRangeEnd w:id="2"/>
+      <w:commentRangeEnd w:id="4"/>
       <w:r>
         <w:rPr>
           <w:rStyle w:val="CommentReference"/>
@@ -444,9 +470,9 @@
           <w:szCs w:val="20"/>
           <w:lang w:val="sr-Cyrl-RS"/>
         </w:rPr>
-        <w:commentReference w:id="2"/>
-      </w:r>
-      <w:commentRangeEnd w:id="3"/>
+        <w:commentReference w:id="4"/>
+      </w:r>
+      <w:commentRangeEnd w:id="5"/>
       <w:r>
         <w:rPr>
           <w:rStyle w:val="CommentReference"/>
@@ -459,7 +485,7 @@
           <w:szCs w:val="20"/>
           <w:lang w:val="sr-Cyrl-RS"/>
         </w:rPr>
-        <w:commentReference w:id="3"/>
+        <w:commentReference w:id="5"/>
       </w:r>
       <w:r>
         <w:rPr>
@@ -639,14 +665,15 @@
         </w:rPr>
         <w:t xml:space="preserve">Носиви уређаји омогућавају прикупљање физиолошких података непосредно са тијела корисника и њихово праћење током свакодневних активности [1]. Савремени паметни сатови садрже сензоре за праћење срчане </w:t>
       </w:r>
-      <w:commentRangeStart w:id="4"/>
+      <w:commentRangeStart w:id="6"/>
+      <w:commentRangeStart w:id="7"/>
       <w:r>
         <w:rPr>
           <w:lang w:val="sr-Cyrl-RS"/>
         </w:rPr>
         <w:t>фреквенције</w:t>
       </w:r>
-      <w:commentRangeEnd w:id="4"/>
+      <w:commentRangeEnd w:id="6"/>
       <w:r>
         <w:rPr>
           <w:rStyle w:val="CommentReference"/>
@@ -654,43 +681,9 @@
           <w:szCs w:val="22"/>
           <w:lang w:val="sr-Cyrl-RS"/>
         </w:rPr>
-        <w:commentReference w:id="4"/>
-      </w:r>
-      <w:r>
-        <w:rPr>
-          <w:lang w:val="sr-Cyrl-RS"/>
-        </w:rPr>
-        <w:t xml:space="preserve">, засићености крви кисеоником, температуре коже и других параметара [1]. Једна од метода која се у њима </w:t>
-      </w:r>
-      <w:r>
-        <w:rPr>
-          <w:lang w:val="sr-Cyrl-RS"/>
-        </w:rPr>
-        <w:t xml:space="preserve">примјењује јесте фотоплетизмографија (енгл. </w:t>
-      </w:r>
-      <w:r>
-        <w:rPr>
-          <w:i/>
-          <w:iCs/>
-          <w:lang w:val="sr-Cyrl-RS"/>
-        </w:rPr>
-        <w:t>photoplethysmography</w:t>
-      </w:r>
-      <w:r>
-        <w:rPr>
-          <w:lang w:val="sr-Cyrl-RS"/>
-        </w:rPr>
-        <w:t xml:space="preserve">, PPG), неинвазивна оптичка метода којом се региструју промјене запремине крви у ткиву [2]. Анализом PPG сигнала могу се издвојити информације о срчаној активности, укључујући </w:t>
-      </w:r>
-      <w:commentRangeStart w:id="5"/>
-      <w:commentRangeStart w:id="6"/>
-      <w:r>
-        <w:rPr>
-          <w:lang w:val="sr-Cyrl-RS"/>
-        </w:rPr>
-        <w:t xml:space="preserve">фреквенцију пулса </w:t>
-      </w:r>
-      <w:commentRangeEnd w:id="5"/>
+        <w:commentReference w:id="6"/>
+      </w:r>
+      <w:commentRangeEnd w:id="7"/>
       <w:r>
         <w:rPr>
           <w:rStyle w:val="CommentReference"/>
@@ -698,9 +691,43 @@
           <w:szCs w:val="22"/>
           <w:lang w:val="sr-Cyrl-RS"/>
         </w:rPr>
-        <w:commentReference w:id="5"/>
-      </w:r>
-      <w:commentRangeEnd w:id="6"/>
+        <w:commentReference w:id="7"/>
+      </w:r>
+      <w:r>
+        <w:rPr>
+          <w:lang w:val="sr-Cyrl-RS"/>
+        </w:rPr>
+        <w:t xml:space="preserve">, засићености крви кисеоником, температуре коже и других параметара [1]. Једна од метода која се у њима </w:t>
+      </w:r>
+      <w:r>
+        <w:rPr>
+          <w:lang w:val="sr-Cyrl-RS"/>
+        </w:rPr>
+        <w:t xml:space="preserve">примјењује јесте фотоплетизмографија (енгл. </w:t>
+      </w:r>
+      <w:r>
+        <w:rPr>
+          <w:i/>
+          <w:iCs/>
+          <w:lang w:val="sr-Cyrl-RS"/>
+        </w:rPr>
+        <w:t>photoplethysmography</w:t>
+      </w:r>
+      <w:r>
+        <w:rPr>
+          <w:lang w:val="sr-Cyrl-RS"/>
+        </w:rPr>
+        <w:t xml:space="preserve">, PPG), неинвазивна оптичка метода којом се региструју промјене запремине крви у ткиву [2]. Анализом PPG сигнала могу се издвојити информације о срчаној активности, укључујући </w:t>
+      </w:r>
+      <w:commentRangeStart w:id="8"/>
+      <w:commentRangeStart w:id="9"/>
+      <w:r>
+        <w:rPr>
+          <w:lang w:val="sr-Cyrl-RS"/>
+        </w:rPr>
+        <w:t xml:space="preserve">фреквенцију пулса </w:t>
+      </w:r>
+      <w:commentRangeEnd w:id="8"/>
       <w:r>
         <w:rPr>
           <w:rStyle w:val="CommentReference"/>
@@ -708,36 +735,9 @@
           <w:szCs w:val="22"/>
           <w:lang w:val="sr-Cyrl-RS"/>
         </w:rPr>
-        <w:commentReference w:id="6"/>
-      </w:r>
-      <w:r>
-        <w:rPr>
-          <w:lang w:val="sr-Cyrl-RS"/>
-        </w:rPr>
-        <w:t>и варијабилност пулсних интервала [2].</w:t>
-      </w:r>
-    </w:p>
-    <w:p>
-      <w:pPr>
-        <w:pStyle w:val="0-"/>
-        <w:rPr>
-          <w:lang w:val="sr-Cyrl-RS"/>
-        </w:rPr>
-      </w:pPr>
-      <w:r>
-        <w:rPr>
-          <w:lang w:val="sr-Cyrl-RS"/>
-        </w:rPr>
-        <w:t xml:space="preserve">Вјежбе </w:t>
-      </w:r>
-      <w:commentRangeStart w:id="7"/>
-      <w:r>
-        <w:rPr>
-          <w:lang w:val="sr-Cyrl-RS"/>
-        </w:rPr>
-        <w:t xml:space="preserve">спорог </w:t>
-      </w:r>
-      <w:commentRangeEnd w:id="7"/>
+        <w:commentReference w:id="8"/>
+      </w:r>
+      <w:commentRangeEnd w:id="9"/>
       <w:r>
         <w:rPr>
           <w:rStyle w:val="CommentReference"/>
@@ -745,13 +745,13 @@
           <w:szCs w:val="22"/>
           <w:lang w:val="sr-Cyrl-RS"/>
         </w:rPr>
-        <w:commentReference w:id="7"/>
-      </w:r>
-      <w:r>
-        <w:rPr>
-          <w:lang w:val="sr-Cyrl-RS"/>
-        </w:rPr>
-        <w:t>контролисаног дисања могу довести до израженијих осцилација срчане фреквенције [3]. У овим вјежбама често се користи ритам од приближно шест респираторних циклуса у минути [3]. Биолошка повратна информација омогућава кориснику да током вјежбе прати сопствену физиолошку активност и учи да на њу утиче [4]. У кардиоваскуларним примјенама за праћење физиолошког одговора могу се користити подаци о срчаној фреквенцији и њеној варијабилности [4].</w:t>
+        <w:commentReference w:id="9"/>
+      </w:r>
+      <w:r>
+        <w:rPr>
+          <w:lang w:val="sr-Cyrl-RS"/>
+        </w:rPr>
+        <w:t>и варијабилност пулсних интервала [2].</w:t>
       </w:r>
     </w:p>
     <w:p>
@@ -765,109 +765,157 @@
         <w:rPr>
           <w:lang w:val="sr-Cyrl-RS"/>
         </w:rPr>
-        <w:t>У овом раду развијен је систем за праћење физиолошких параметара заснован на паметном сату и мобилном телефону. Систем омогућава прикупљање и обраду PPG сигнала у реалном времену, одређивање фреквенције пулса и реализацију вођеног дисања уз биолошку повратну информацију. Подаци са паметног сата преносе се на мобилни телефон, гдје се чувају, приказују и могу извозити ради накнадне анализе. Систем је испитан кроз три узастопна мјерења са спонтаним и вођеним дисањем ради анализе промјена срчане активности.</w:t>
-      </w:r>
-    </w:p>
-    <w:p>
-      <w:pPr>
-        <w:pStyle w:val="1-"/>
-        <w:rPr>
-          <w:lang w:val="sr-Cyrl-RS"/>
-        </w:rPr>
-      </w:pPr>
-      <w:r>
-        <w:rPr>
-          <w:lang w:val="sr-Cyrl-RS"/>
-        </w:rPr>
-        <w:t>ТЕОРИЈСКЕ ОСНОВЕ</w:t>
-      </w:r>
-    </w:p>
-    <w:p>
-      <w:pPr>
-        <w:pStyle w:val="0-"/>
-      </w:pPr>
-      <w:commentRangeStart w:id="8"/>
-      <w:r>
-        <w:t xml:space="preserve">Фотоплетизмографски </w:t>
-      </w:r>
-      <w:commentRangeEnd w:id="8"/>
+        <w:t xml:space="preserve">Вјежбе </w:t>
+      </w:r>
+      <w:commentRangeStart w:id="10"/>
+      <w:commentRangeStart w:id="11"/>
+      <w:r>
+        <w:rPr>
+          <w:lang w:val="sr-Cyrl-RS"/>
+        </w:rPr>
+        <w:t xml:space="preserve">спорог </w:t>
+      </w:r>
+      <w:commentRangeEnd w:id="10"/>
       <w:r>
         <w:rPr>
           <w:rStyle w:val="CommentReference"/>
           <w:sz w:val="20"/>
           <w:szCs w:val="22"/>
-        </w:rPr>
-        <w:commentReference w:id="8"/>
-      </w:r>
-      <w:r>
-        <w:t>сигнал садржи пулсатилну компоненту, која настаје усљед периодичних промјена запремине артеријске крви током срчаног циклуса, и споро промјенљиву компоненту која представља основни ниво сигнала</w:t>
-      </w:r>
-      <w:r>
-        <w:t xml:space="preserve"> око којег се јављају ове пулсатилне промјене</w:t>
-      </w:r>
-      <w:r>
-        <w:t xml:space="preserve"> [2]. </w:t>
-      </w:r>
-      <w:commentRangeStart w:id="9"/>
-      <w:r>
-        <w:t>У оквиру сваког пулсног таласа може се издвојити систолни врх, који одговара најизраженијој промјени запремине крви током посматраног циклуса</w:t>
-      </w:r>
-      <w:r>
-        <w:t xml:space="preserve"> [2]</w:t>
-      </w:r>
-      <w:r>
-        <w:t>.</w:t>
-      </w:r>
-      <w:commentRangeEnd w:id="9"/>
+          <w:lang w:val="sr-Cyrl-RS"/>
+        </w:rPr>
+        <w:commentReference w:id="10"/>
+      </w:r>
+      <w:commentRangeEnd w:id="11"/>
       <w:r>
         <w:rPr>
           <w:rStyle w:val="CommentReference"/>
           <w:sz w:val="20"/>
           <w:szCs w:val="22"/>
-        </w:rPr>
-        <w:commentReference w:id="9"/>
-      </w:r>
-      <w:r>
-        <w:t xml:space="preserve"> Временски размак између два узастопна систолна врха представља интервал између узастопних </w:t>
-      </w:r>
-      <w:commentRangeStart w:id="10"/>
-      <w:r>
-        <w:t xml:space="preserve">пулсева </w:t>
-      </w:r>
-      <w:commentRangeEnd w:id="10"/>
+          <w:lang w:val="sr-Cyrl-RS"/>
+        </w:rPr>
+        <w:commentReference w:id="11"/>
+      </w:r>
+      <w:r>
+        <w:rPr>
+          <w:lang w:val="sr-Cyrl-RS"/>
+        </w:rPr>
+        <w:t>контролисаног дисања могу довести до израженијих осцилација срчане фреквенције [3]. У овим вјежбама често се користи ритам од приближно шест респираторних циклуса у минути [3]. Биолошка повратна информација омогућава кориснику да током вјежбе прати сопствену физиолошку активност и учи да на њу утиче [4]. У кардиоваскуларним примјенама за праћење физиолошког одговора могу се користити подаци о срчаној фреквенцији и њеној варијабилности [4].</w:t>
+      </w:r>
+    </w:p>
+    <w:p>
+      <w:pPr>
+        <w:pStyle w:val="0-"/>
+        <w:rPr>
+          <w:lang w:val="sr-Cyrl-RS"/>
+        </w:rPr>
+      </w:pPr>
+      <w:r>
+        <w:rPr>
+          <w:lang w:val="sr-Cyrl-RS"/>
+        </w:rPr>
+        <w:t>У овом раду развијен је систем за праћење физиолошких параметара заснован на паметном сату и мобилном телефону. Систем омогућава прикупљање и обраду PPG сигнала у реалном времену, одређивање фреквенције пулса и реализацију вођеног дисања уз биолошку повратну информацију. Подаци са паметног сата преносе се на мобилни телефон, гдје се чувају, приказују и могу извозити ради накнадне анализе. Систем је испитан кроз три узастопна мјерења са спонтаним и вођеним дисањем ради анализе промјена срчане активности.</w:t>
+      </w:r>
+    </w:p>
+    <w:p>
+      <w:pPr>
+        <w:pStyle w:val="1-"/>
+        <w:rPr>
+          <w:lang w:val="sr-Cyrl-RS"/>
+        </w:rPr>
+      </w:pPr>
+      <w:r>
+        <w:rPr>
+          <w:lang w:val="sr-Cyrl-RS"/>
+        </w:rPr>
+        <w:t>ТЕОРИЈСКЕ ОСНОВЕ</w:t>
+      </w:r>
+    </w:p>
+    <w:p>
+      <w:pPr>
+        <w:pStyle w:val="0-"/>
+      </w:pPr>
+      <w:commentRangeStart w:id="12"/>
+      <w:r>
+        <w:t xml:space="preserve">Фотоплетизмографски </w:t>
+      </w:r>
+      <w:commentRangeEnd w:id="12"/>
       <w:r>
         <w:rPr>
           <w:rStyle w:val="CommentReference"/>
           <w:sz w:val="20"/>
           <w:szCs w:val="22"/>
         </w:rPr>
-        <w:commentReference w:id="10"/>
-      </w:r>
-      <w:r>
-        <w:t xml:space="preserve">(енгл. pulse-to-pulse interval, PPI) и омогућава одређивање </w:t>
-      </w:r>
-      <w:commentRangeStart w:id="11"/>
-      <w:commentRangeStart w:id="12"/>
-      <w:r>
-        <w:t xml:space="preserve">фреквенције </w:t>
-      </w:r>
-      <w:commentRangeEnd w:id="11"/>
+        <w:commentReference w:id="12"/>
+      </w:r>
+      <w:r>
+        <w:t>сигнал садржи пулсатилну компоненту, која настаје усљед периодичних промјена запремине артеријске крви током срчаног циклуса, и споро промјенљиву компоненту која представља основни ниво сигнала</w:t>
+      </w:r>
+      <w:r>
+        <w:t xml:space="preserve"> око којег се јављају ове пулсатилне промјене</w:t>
+      </w:r>
+      <w:r>
+        <w:t xml:space="preserve"> [2]. </w:t>
+      </w:r>
+      <w:commentRangeStart w:id="13"/>
+      <w:r>
+        <w:t>У оквиру сваког пулсног таласа може се издвојити систолни врх, који одговара најизраженијој промјени запремине крви током посматраног циклуса</w:t>
+      </w:r>
+      <w:r>
+        <w:t xml:space="preserve"> [2]</w:t>
+      </w:r>
+      <w:r>
+        <w:t>.</w:t>
+      </w:r>
+      <w:commentRangeEnd w:id="13"/>
       <w:r>
         <w:rPr>
           <w:rStyle w:val="CommentReference"/>
           <w:sz w:val="20"/>
           <w:szCs w:val="22"/>
         </w:rPr>
-        <w:commentReference w:id="11"/>
-      </w:r>
-      <w:commentRangeEnd w:id="12"/>
+        <w:commentReference w:id="13"/>
+      </w:r>
+      <w:r>
+        <w:t xml:space="preserve"> Временски размак између два узастопна систолна врха представља интервал између узастопних </w:t>
+      </w:r>
+      <w:commentRangeStart w:id="14"/>
+      <w:r>
+        <w:t xml:space="preserve">пулсева </w:t>
+      </w:r>
+      <w:commentRangeEnd w:id="14"/>
       <w:r>
         <w:rPr>
           <w:rStyle w:val="CommentReference"/>
           <w:sz w:val="20"/>
           <w:szCs w:val="22"/>
         </w:rPr>
-        <w:commentReference w:id="12"/>
+        <w:commentReference w:id="14"/>
+      </w:r>
+      <w:r>
+        <w:t xml:space="preserve">(енгл. pulse-to-pulse interval, PPI) и омогућава одређивање </w:t>
+      </w:r>
+      <w:commentRangeStart w:id="15"/>
+      <w:commentRangeStart w:id="16"/>
+      <w:r>
+        <w:t xml:space="preserve">фреквенције </w:t>
+      </w:r>
+      <w:commentRangeEnd w:id="15"/>
+      <w:r>
+        <w:rPr>
+          <w:rStyle w:val="CommentReference"/>
+          <w:sz w:val="20"/>
+          <w:szCs w:val="22"/>
+        </w:rPr>
+        <w:commentReference w:id="15"/>
+      </w:r>
+      <w:commentRangeEnd w:id="16"/>
+      <w:r>
+        <w:rPr>
+          <w:rStyle w:val="CommentReference"/>
+          <w:sz w:val="20"/>
+          <w:szCs w:val="22"/>
+        </w:rPr>
+        <w:commentReference w:id="16"/>
       </w:r>
       <w:r>
         <w:t>пулса</w:t>
@@ -916,28 +964,28 @@
         <w:lastRenderedPageBreak/>
         <w:t xml:space="preserve">Пулсни интервали нису потпуно једнаког трајања, већ се њихове вриједности мијењају током времена. Ове промјене могу се описати варијабилношћу </w:t>
       </w:r>
-      <w:commentRangeStart w:id="13"/>
-      <w:commentRangeStart w:id="14"/>
+      <w:commentRangeStart w:id="17"/>
+      <w:commentRangeStart w:id="18"/>
       <w:r>
         <w:t xml:space="preserve">фреквенције </w:t>
       </w:r>
-      <w:commentRangeEnd w:id="13"/>
+      <w:commentRangeEnd w:id="17"/>
       <w:r>
         <w:rPr>
           <w:rStyle w:val="CommentReference"/>
           <w:sz w:val="20"/>
           <w:szCs w:val="22"/>
         </w:rPr>
-        <w:commentReference w:id="13"/>
-      </w:r>
-      <w:commentRangeEnd w:id="14"/>
+        <w:commentReference w:id="17"/>
+      </w:r>
+      <w:commentRangeEnd w:id="18"/>
       <w:r>
         <w:rPr>
           <w:rStyle w:val="CommentReference"/>
           <w:sz w:val="20"/>
           <w:szCs w:val="22"/>
         </w:rPr>
-        <w:commentReference w:id="14"/>
+        <w:commentReference w:id="18"/>
       </w:r>
       <w:r>
         <w:t xml:space="preserve">пулса (енгл. </w:t>
@@ -1054,18 +1102,18 @@
       <w:r>
         <w:t xml:space="preserve">За реализацију мјерења коришћен је паметни сат Samsung </w:t>
       </w:r>
-      <w:commentRangeStart w:id="15"/>
+      <w:commentRangeStart w:id="19"/>
       <w:r>
         <w:t xml:space="preserve">Galaxy Watch6 </w:t>
       </w:r>
-      <w:commentRangeEnd w:id="15"/>
+      <w:commentRangeEnd w:id="19"/>
       <w:r>
         <w:rPr>
           <w:rStyle w:val="CommentReference"/>
           <w:sz w:val="20"/>
           <w:szCs w:val="22"/>
         </w:rPr>
-        <w:commentReference w:id="15"/>
+        <w:commentReference w:id="19"/>
       </w:r>
       <w:r>
         <w:t>са оперативним системом Wear OS. Систем омогућава прикупљање података о срчаној фреквенцији, температури коже, засићености крви кисеоником и фотоплетизмографском сигналу. При прикупљању PPG сигнала добијају се узорци зеленог, црвеног и инфрацрвеног канала са фреквенцијом узорковања од 25 Hz [7]. За обраду сигнала у реалном времену коришћен је зелени PPG канал.</w:t>
@@ -1075,57 +1123,67 @@
       <w:pPr>
         <w:pStyle w:val="0-"/>
       </w:pPr>
-      <w:commentRangeStart w:id="16"/>
+      <w:commentRangeStart w:id="20"/>
+      <w:commentRangeStart w:id="21"/>
       <w:r>
         <w:t xml:space="preserve">Размјена података између паметног сата и мобилног телефона реализована је посредством програмског интерфејса Wearable Data Layer [8]. </w:t>
       </w:r>
-      <w:commentRangeEnd w:id="16"/>
+      <w:commentRangeEnd w:id="20"/>
       <w:r>
         <w:rPr>
           <w:rStyle w:val="CommentReference"/>
           <w:sz w:val="20"/>
           <w:szCs w:val="22"/>
         </w:rPr>
-        <w:commentReference w:id="16"/>
-      </w:r>
-      <w:r>
-        <w:t>Током рада са сата се преносе тренутне вриједности праћених</w:t>
-      </w:r>
-      <w:r>
-        <w:t xml:space="preserve"> </w:t>
-      </w:r>
-      <w:r>
-        <w:t xml:space="preserve">физиолошких параметара, док се након завршетка PPG мјерења </w:t>
-      </w:r>
-      <w:r>
-        <w:rPr>
-          <w:rStyle w:val="0-Char"/>
-        </w:rPr>
-        <w:t>преноси комплетна мјерна сесија. Мобилна апликација омогућава локално чување и преглед PPG сесија, као и извоз прикупљених података у XLSX формату ради накнадне анализе.</w:t>
-      </w:r>
-      <w:r>
-        <w:t xml:space="preserve"> </w:t>
-      </w:r>
-    </w:p>
-    <w:p>
-      <w:pPr>
-        <w:pStyle w:val="0-"/>
-      </w:pPr>
-      <w:r>
-        <w:t xml:space="preserve">Прикупљени зелени PPG сигнал обрађује се у реалном времену током мјерне сесије. Најприје се уклања споро промјенљива основна линија </w:t>
-      </w:r>
-      <w:commentRangeStart w:id="17"/>
-      <w:r>
-        <w:t>примјеном центрираног покретног просјека са прозором од 2 s</w:t>
-      </w:r>
-      <w:commentRangeEnd w:id="17"/>
+        <w:commentReference w:id="20"/>
+      </w:r>
+      <w:commentRangeEnd w:id="21"/>
       <w:r>
         <w:rPr>
           <w:rStyle w:val="CommentReference"/>
           <w:sz w:val="20"/>
           <w:szCs w:val="22"/>
         </w:rPr>
-        <w:commentReference w:id="17"/>
+        <w:commentReference w:id="21"/>
+      </w:r>
+      <w:r>
+        <w:t>Током рада са сата се преносе тренутне вриједности праћених</w:t>
+      </w:r>
+      <w:r>
+        <w:t xml:space="preserve"> </w:t>
+      </w:r>
+      <w:r>
+        <w:t xml:space="preserve">физиолошких параметара, док се након завршетка PPG мјерења </w:t>
+      </w:r>
+      <w:r>
+        <w:rPr>
+          <w:rStyle w:val="0-Char"/>
+        </w:rPr>
+        <w:t>преноси комплетна мјерна сесија. Мобилна апликација омогућава локално чување и преглед PPG сесија, као и извоз прикупљених података у XLSX формату ради накнадне анализе.</w:t>
+      </w:r>
+      <w:r>
+        <w:t xml:space="preserve"> </w:t>
+      </w:r>
+    </w:p>
+    <w:p>
+      <w:pPr>
+        <w:pStyle w:val="0-"/>
+      </w:pPr>
+      <w:r>
+        <w:t xml:space="preserve">Прикупљени зелени PPG сигнал обрађује се у реалном времену током мјерне сесије. Најприје се уклања споро промјенљива основна линија </w:t>
+      </w:r>
+      <w:commentRangeStart w:id="22"/>
+      <w:r>
+        <w:t>примјеном центрираног покретног просјека са прозором од 2 s</w:t>
+      </w:r>
+      <w:commentRangeEnd w:id="22"/>
+      <w:r>
+        <w:rPr>
+          <w:rStyle w:val="CommentReference"/>
+          <w:sz w:val="20"/>
+          <w:szCs w:val="22"/>
+        </w:rPr>
+        <w:commentReference w:id="22"/>
       </w:r>
       <w:r>
         <w:t>, након чега се сигнал филтрира у фреквенцијском опсегу од 0,7 до 5 Hz и инвертује. Систолни врхови одређују се проналажењем локалних максимума у обрађеном сигналу, уз провјеру временског размака између сусједних врхова. На основу временских интервала између узастопних прихваћених врхова одређује се фреквенција пулса, која се заједно са обрађеним сигналом и детектованим врховима приказује кориснику током мјерења.</w:t>
@@ -1225,7 +1283,7 @@
         <w:pStyle w:val="Caption"/>
         <w:ind w:firstLine="0"/>
       </w:pPr>
-      <w:commentRangeStart w:id="18"/>
+      <w:commentRangeStart w:id="23"/>
       <w:r>
         <w:t xml:space="preserve">Слика </w:t>
       </w:r>
@@ -1268,14 +1326,14 @@
         </w:rPr>
         <w:t>)</w:t>
       </w:r>
-      <w:commentRangeEnd w:id="18"/>
+      <w:commentRangeEnd w:id="23"/>
       <w:r>
         <w:rPr>
           <w:rStyle w:val="CommentReference"/>
           <w:sz w:val="18"/>
           <w:szCs w:val="18"/>
         </w:rPr>
-        <w:commentReference w:id="18"/>
+        <w:commentReference w:id="23"/>
       </w:r>
     </w:p>
     <w:p>
@@ -1439,21 +1497,31 @@
       <w:r>
         <w:t xml:space="preserve">На основу детектованих систолних врхова израчунати су PPI интервали, из којих су одређене просјечна, минимална и максимална фреквенција пулса, као и показатељи варијабилности SDNN и RMSSD. Поред анализе у временском домену, извршена је и </w:t>
       </w:r>
-      <w:commentRangeStart w:id="19"/>
+      <w:commentRangeStart w:id="24"/>
+      <w:commentRangeStart w:id="25"/>
       <w:r>
         <w:t>с</w:t>
       </w:r>
       <w:r>
         <w:t xml:space="preserve">пектрална </w:t>
       </w:r>
-      <w:commentRangeEnd w:id="19"/>
+      <w:commentRangeEnd w:id="24"/>
       <w:r>
         <w:rPr>
           <w:rStyle w:val="CommentReference"/>
           <w:sz w:val="20"/>
           <w:szCs w:val="22"/>
         </w:rPr>
-        <w:commentReference w:id="19"/>
+        <w:commentReference w:id="24"/>
+      </w:r>
+      <w:commentRangeEnd w:id="25"/>
+      <w:r>
+        <w:rPr>
+          <w:rStyle w:val="CommentReference"/>
+          <w:sz w:val="20"/>
+          <w:szCs w:val="22"/>
+        </w:rPr>
+        <w:commentReference w:id="25"/>
       </w:r>
       <w:r>
         <w:t>анализа PPI интервала.</w:t>
@@ -2476,14 +2544,14 @@
         </w:rPr>
         <w:t xml:space="preserve">2 била је </w:t>
       </w:r>
-      <w:commentRangeStart w:id="20"/>
+      <w:commentRangeStart w:id="26"/>
       <w:r>
         <w:rPr>
           <w:lang w:val="ru-RU"/>
         </w:rPr>
         <w:t xml:space="preserve">приближно 45,9 </w:t>
       </w:r>
-      <w:commentRangeEnd w:id="20"/>
+      <w:commentRangeEnd w:id="26"/>
       <w:r>
         <w:rPr>
           <w:rStyle w:val="CommentReference"/>
@@ -2491,7 +2559,7 @@
           <w:szCs w:val="22"/>
           <w:lang w:val="ru-RU"/>
         </w:rPr>
-        <w:commentReference w:id="20"/>
+        <w:commentReference w:id="26"/>
       </w:r>
       <w:r>
         <w:rPr>
@@ -2685,18 +2753,18 @@
       <w:pPr>
         <w:pStyle w:val="1-"/>
       </w:pPr>
-      <w:commentRangeStart w:id="21"/>
+      <w:commentRangeStart w:id="27"/>
       <w:r>
         <w:t>ЗАКЉУЧАК</w:t>
       </w:r>
-      <w:commentRangeEnd w:id="21"/>
+      <w:commentRangeEnd w:id="27"/>
       <w:r>
         <w:rPr>
           <w:rStyle w:val="CommentReference"/>
           <w:sz w:val="20"/>
           <w:szCs w:val="20"/>
         </w:rPr>
-        <w:commentReference w:id="21"/>
+        <w:commentReference w:id="27"/>
       </w:r>
     </w:p>
     <w:p>
@@ -2706,18 +2774,18 @@
       <w:r>
         <w:t xml:space="preserve">У раду је реализован систем за праћење физиолошких параметара заснован на паметном сату и мобилном телефону, који омогућава прикупљање и обраду PPG сигнала и извођење вођеног дисања уз биолошку повратну информацију. Резултати су показали да током вођеног дисања </w:t>
       </w:r>
-      <w:commentRangeStart w:id="22"/>
+      <w:commentRangeStart w:id="28"/>
       <w:r>
         <w:t xml:space="preserve">није дошло </w:t>
       </w:r>
-      <w:commentRangeEnd w:id="22"/>
+      <w:commentRangeEnd w:id="28"/>
       <w:r>
         <w:rPr>
           <w:rStyle w:val="CommentReference"/>
           <w:sz w:val="20"/>
           <w:szCs w:val="22"/>
         </w:rPr>
-        <w:commentReference w:id="22"/>
+        <w:commentReference w:id="28"/>
       </w:r>
       <w:r>
         <w:t xml:space="preserve">до изражене промјене просјечне фреквенције пулса, али су уочене већа варијабилност пулсних интервала и израженије периодичне промјене срчане активности. Тиме је у </w:t>
@@ -3332,7 +3400,7 @@
       </w:r>
     </w:p>
   </w:comment>
-  <w:comment w:id="1" w:author="Nikola Petrović" w:date="2026-10-06T12:18:00Z" w:initials="NP">
+  <w:comment w:id="1" w:author="R2 15/2024 - Zarić Nada" w:date="2026-10-13T11:03:00Z" w:initials="NZ">
     <w:p>
       <w:pPr>
         <w:pStyle w:val="CommentText"/>
@@ -3346,32 +3414,17 @@
         <w:annotationRef/>
       </w:r>
       <w:r>
-        <w:t xml:space="preserve">Development of a Smartwatch-Based </w:t>
-      </w:r>
-      <w:r>
-        <w:rPr>
-          <w:lang w:val="sr-Latn-RS"/>
-        </w:rPr>
-        <w:t>P</w:t>
-      </w:r>
-      <w:r>
         <w:rPr>
           <w:lang w:val="en-US"/>
         </w:rPr>
-        <w:t>hotoplethysmography</w:t>
-      </w:r>
-      <w:r>
-        <w:rPr>
-          <w:lang w:val="sr-Latn-RS"/>
-        </w:rPr>
-        <w:t xml:space="preserve"> </w:t>
-      </w:r>
-      <w:r>
-        <w:t xml:space="preserve">Biofeedback System </w:t>
+        <w:t>I</w:t>
+      </w:r>
+      <w:r>
+        <w:t>spravljeno u Radu za zbornik &amp; Master radu</w:t>
       </w:r>
     </w:p>
   </w:comment>
-  <w:comment w:id="2" w:author="Nikola Petrović" w:date="2026-10-06T11:14:00Z" w:initials="NP">
+  <w:comment w:id="2" w:author="Nikola Petrović" w:date="2026-10-06T12:18:00Z" w:initials="NP">
     <w:p>
       <w:pPr>
         <w:pStyle w:val="CommentText"/>
@@ -3385,14 +3438,32 @@
         <w:annotationRef/>
       </w:r>
       <w:r>
+        <w:t xml:space="preserve">Development of a Smartwatch-Based </w:t>
+      </w:r>
+      <w:r>
         <w:rPr>
           <w:lang w:val="sr-Latn-RS"/>
         </w:rPr>
-        <w:t>Napisati baš biofidbek</w:t>
+        <w:t>P</w:t>
+      </w:r>
+      <w:r>
+        <w:rPr>
+          <w:lang w:val="en-US"/>
+        </w:rPr>
+        <w:t>hotoplethysmography</w:t>
+      </w:r>
+      <w:r>
+        <w:rPr>
+          <w:lang w:val="sr-Latn-RS"/>
+        </w:rPr>
+        <w:t xml:space="preserve"> </w:t>
+      </w:r>
+      <w:r>
+        <w:t xml:space="preserve">Biofeedback System </w:t>
       </w:r>
     </w:p>
   </w:comment>
-  <w:comment w:id="3" w:author="R2 15/2024 - Zarić Nada" w:date="2026-10-08T14:47:00Z" w:initials="NZ">
+  <w:comment w:id="3" w:author="R2 15/2024 - Zarić Nada" w:date="2026-10-13T11:03:00Z" w:initials="NZ">
     <w:p>
       <w:pPr>
         <w:pStyle w:val="CommentText"/>
@@ -3409,11 +3480,14 @@
         <w:rPr>
           <w:lang w:val="en-US"/>
         </w:rPr>
-        <w:t>Ispravljeno u Radu za zbornik &amp; Master radu</w:t>
+        <w:t>I</w:t>
+      </w:r>
+      <w:r>
+        <w:t>spravljeno u Radu za zbornik &amp; Master radu</w:t>
       </w:r>
     </w:p>
   </w:comment>
-  <w:comment w:id="4" w:author="Nikola Petrović" w:date="2026-10-06T11:16:00Z" w:initials="NP">
+  <w:comment w:id="4" w:author="Nikola Petrović" w:date="2026-10-06T11:14:00Z" w:initials="NP">
     <w:p>
       <w:pPr>
         <w:pStyle w:val="CommentText"/>
@@ -3430,35 +3504,32 @@
         <w:rPr>
           <w:lang w:val="sr-Latn-RS"/>
         </w:rPr>
-        <w:t>ritma</w:t>
+        <w:t>Napisati baš biofidbek</w:t>
       </w:r>
     </w:p>
   </w:comment>
-  <w:comment w:id="5" w:author="Nikola Petrović" w:date="2026-10-06T11:17:00Z" w:initials="NP">
+  <w:comment w:id="5" w:author="R2 15/2024 - Zarić Nada" w:date="2026-10-08T14:47:00Z" w:initials="NZ">
     <w:p>
       <w:pPr>
         <w:pStyle w:val="CommentText"/>
         <w:ind w:firstLine="0"/>
         <w:jc w:val="left"/>
+      </w:pPr>
+      <w:r>
+        <w:rPr>
+          <w:rStyle w:val="CommentReference"/>
+        </w:rPr>
+        <w:annotationRef/>
+      </w:r>
+      <w:r>
         <w:rPr>
           <w:lang w:val="en-US"/>
         </w:rPr>
-      </w:pPr>
-      <w:r>
-        <w:rPr>
-          <w:rStyle w:val="CommentReference"/>
-        </w:rPr>
-        <w:annotationRef/>
-      </w:r>
-      <w:r>
-        <w:rPr>
-          <w:lang w:val="sr-Latn-RS"/>
-        </w:rPr>
-        <w:t>puls</w:t>
+        <w:t>Ispravljeno u Radu za zbornik &amp; Master radu</w:t>
       </w:r>
     </w:p>
   </w:comment>
-  <w:comment w:id="6" w:author="R2 15/2024 - Zarić Nada" w:date="2026-10-08T15:19:00Z" w:initials="NZ">
+  <w:comment w:id="6" w:author="Nikola Petrović" w:date="2026-10-06T11:16:00Z" w:initials="NP">
     <w:p>
       <w:pPr>
         <w:pStyle w:val="CommentText"/>
@@ -3473,16 +3544,13 @@
       </w:r>
       <w:r>
         <w:rPr>
-          <w:lang w:val="en-US"/>
-        </w:rPr>
-        <w:t>I</w:t>
-      </w:r>
-      <w:r>
-        <w:t>spravljeno u Radu za zbornik &amp; Master radu</w:t>
+          <w:lang w:val="sr-Latn-RS"/>
+        </w:rPr>
+        <w:t>ritma</w:t>
       </w:r>
     </w:p>
   </w:comment>
-  <w:comment w:id="7" w:author="Nikola Petrović" w:date="2026-10-06T11:17:00Z" w:initials="NP">
+  <w:comment w:id="7" w:author="R2 15/2024 - Zarić Nada" w:date="2026-10-13T11:03:00Z" w:initials="NZ">
     <w:p>
       <w:pPr>
         <w:pStyle w:val="CommentText"/>
@@ -3497,18 +3565,24 @@
       </w:r>
       <w:r>
         <w:rPr>
-          <w:lang w:val="sr-Latn-RS"/>
-        </w:rPr>
-        <w:t>obrisati</w:t>
+          <w:lang w:val="en-US"/>
+        </w:rPr>
+        <w:t>I</w:t>
+      </w:r>
+      <w:r>
+        <w:t>spravljeno u Radu za zbornik &amp; Master radu</w:t>
       </w:r>
     </w:p>
   </w:comment>
-  <w:comment w:id="8" w:author="Nikola Petrović" w:date="2026-10-06T11:18:00Z" w:initials="NP">
+  <w:comment w:id="8" w:author="Nikola Petrović" w:date="2026-10-06T11:17:00Z" w:initials="NP">
     <w:p>
       <w:pPr>
         <w:pStyle w:val="CommentText"/>
         <w:ind w:firstLine="0"/>
         <w:jc w:val="left"/>
+        <w:rPr>
+          <w:lang w:val="en-US"/>
+        </w:rPr>
       </w:pPr>
       <w:r>
         <w:rPr>
@@ -3520,11 +3594,11 @@
         <w:rPr>
           <w:lang w:val="sr-Latn-RS"/>
         </w:rPr>
-        <w:t>Piši skraćenicu ako si je već uvela</w:t>
+        <w:t>puls</w:t>
       </w:r>
     </w:p>
   </w:comment>
-  <w:comment w:id="9" w:author="Nikola Petrović" w:date="2026-10-06T11:19:00Z" w:initials="NP">
+  <w:comment w:id="9" w:author="R2 15/2024 - Zarić Nada" w:date="2026-10-08T15:19:00Z" w:initials="NZ">
     <w:p>
       <w:pPr>
         <w:pStyle w:val="CommentText"/>
@@ -3539,13 +3613,16 @@
       </w:r>
       <w:r>
         <w:rPr>
-          <w:lang w:val="sr-Latn-RS"/>
-        </w:rPr>
-        <w:t>Treba preformulisati</w:t>
+          <w:lang w:val="en-US"/>
+        </w:rPr>
+        <w:t>I</w:t>
+      </w:r>
+      <w:r>
+        <w:t>spravljeno u Radu za zbornik &amp; Master radu</w:t>
       </w:r>
     </w:p>
   </w:comment>
-  <w:comment w:id="10" w:author="Nikola Petrović" w:date="2026-10-06T11:19:00Z" w:initials="NP">
+  <w:comment w:id="10" w:author="Nikola Petrović" w:date="2026-10-06T11:17:00Z" w:initials="NP">
     <w:p>
       <w:pPr>
         <w:pStyle w:val="CommentText"/>
@@ -3562,11 +3639,11 @@
         <w:rPr>
           <w:lang w:val="sr-Latn-RS"/>
         </w:rPr>
-        <w:t>otkucaja</w:t>
+        <w:t>obrisati</w:t>
       </w:r>
     </w:p>
   </w:comment>
-  <w:comment w:id="11" w:author="Nikola Petrović" w:date="2026-10-06T11:20:00Z" w:initials="NP">
+  <w:comment w:id="11" w:author="R2 15/2024 - Zarić Nada" w:date="2026-10-13T11:04:00Z" w:initials="NZ">
     <w:p>
       <w:pPr>
         <w:pStyle w:val="CommentText"/>
@@ -3581,13 +3658,16 @@
       </w:r>
       <w:r>
         <w:rPr>
-          <w:lang w:val="sr-Latn-RS"/>
-        </w:rPr>
-        <w:t>obrisati</w:t>
+          <w:lang w:val="en-US"/>
+        </w:rPr>
+        <w:t>I</w:t>
+      </w:r>
+      <w:r>
+        <w:t>spravljeno u Radu za zbornik &amp; Master radu</w:t>
       </w:r>
     </w:p>
   </w:comment>
-  <w:comment w:id="12" w:author="R2 15/2024 - Zarić Nada" w:date="2026-10-08T15:20:00Z" w:initials="NZ">
+  <w:comment w:id="12" w:author="Nikola Petrović" w:date="2026-10-06T11:18:00Z" w:initials="NP">
     <w:p>
       <w:pPr>
         <w:pStyle w:val="CommentText"/>
@@ -3601,11 +3681,14 @@
         <w:annotationRef/>
       </w:r>
       <w:r>
-        <w:t>spravljeno u Radu za zbornik &amp; Master radu</w:t>
+        <w:rPr>
+          <w:lang w:val="sr-Latn-RS"/>
+        </w:rPr>
+        <w:t>Piši skraćenicu ako si je već uvela</w:t>
       </w:r>
     </w:p>
   </w:comment>
-  <w:comment w:id="13" w:author="Nikola Petrović" w:date="2026-10-06T11:21:00Z" w:initials="NP">
+  <w:comment w:id="13" w:author="Nikola Petrović" w:date="2026-10-06T11:19:00Z" w:initials="NP">
     <w:p>
       <w:pPr>
         <w:pStyle w:val="CommentText"/>
@@ -3622,11 +3705,11 @@
         <w:rPr>
           <w:lang w:val="sr-Latn-RS"/>
         </w:rPr>
-        <w:t>Obrisati</w:t>
+        <w:t>Treba preformulisati</w:t>
       </w:r>
     </w:p>
   </w:comment>
-  <w:comment w:id="14" w:author="R2 15/2024 - Zarić Nada" w:date="2026-10-08T15:20:00Z" w:initials="NZ">
+  <w:comment w:id="14" w:author="Nikola Petrović" w:date="2026-10-06T11:19:00Z" w:initials="NP">
     <w:p>
       <w:pPr>
         <w:pStyle w:val="CommentText"/>
@@ -3640,11 +3723,14 @@
         <w:annotationRef/>
       </w:r>
       <w:r>
-        <w:t>spravljeno u Radu za zbornik &amp; Master radu</w:t>
+        <w:rPr>
+          <w:lang w:val="sr-Latn-RS"/>
+        </w:rPr>
+        <w:t>otkucaja</w:t>
       </w:r>
     </w:p>
   </w:comment>
-  <w:comment w:id="15" w:author="Nikola Petrović" w:date="2026-10-06T11:24:00Z" w:initials="NP">
+  <w:comment w:id="15" w:author="Nikola Petrović" w:date="2026-10-06T11:20:00Z" w:initials="NP">
     <w:p>
       <w:pPr>
         <w:pStyle w:val="CommentText"/>
@@ -3661,11 +3747,11 @@
         <w:rPr>
           <w:lang w:val="sr-Latn-RS"/>
         </w:rPr>
-        <w:t>Dodati sliku uređaja</w:t>
+        <w:t>obrisati</w:t>
       </w:r>
     </w:p>
   </w:comment>
-  <w:comment w:id="16" w:author="Nikola Petrović" w:date="2026-10-06T11:24:00Z" w:initials="NP">
+  <w:comment w:id="16" w:author="R2 15/2024 - Zarić Nada" w:date="2026-10-08T15:20:00Z" w:initials="NZ">
     <w:p>
       <w:pPr>
         <w:pStyle w:val="CommentText"/>
@@ -3680,13 +3766,16 @@
       </w:r>
       <w:r>
         <w:rPr>
-          <w:lang w:val="sr-Latn-RS"/>
-        </w:rPr>
-        <w:t>Dodati blok dijagram sistema</w:t>
+          <w:lang w:val="en-US"/>
+        </w:rPr>
+        <w:t>I</w:t>
+      </w:r>
+      <w:r>
+        <w:t>spravljeno u Radu za zbornik &amp; Master radu</w:t>
       </w:r>
     </w:p>
   </w:comment>
-  <w:comment w:id="17" w:author="Nikola Petrović" w:date="2026-10-06T11:25:00Z" w:initials="NP">
+  <w:comment w:id="17" w:author="Nikola Petrović" w:date="2026-10-06T11:21:00Z" w:initials="NP">
     <w:p>
       <w:pPr>
         <w:pStyle w:val="CommentText"/>
@@ -3703,11 +3792,11 @@
         <w:rPr>
           <w:lang w:val="sr-Latn-RS"/>
         </w:rPr>
-        <w:t>Uzeti prikladniji termin</w:t>
+        <w:t>Obrisati</w:t>
       </w:r>
     </w:p>
   </w:comment>
-  <w:comment w:id="18" w:author="Nikola Petrović" w:date="2026-10-06T12:15:00Z" w:initials="NP">
+  <w:comment w:id="18" w:author="R2 15/2024 - Zarić Nada" w:date="2026-10-08T15:20:00Z" w:initials="NZ">
     <w:p>
       <w:pPr>
         <w:pStyle w:val="CommentText"/>
@@ -3721,14 +3810,11 @@
         <w:annotationRef/>
       </w:r>
       <w:r>
-        <w:rPr>
-          <w:lang w:val="sr-Latn-RS"/>
-        </w:rPr>
-        <w:t>Preciznije opisati biofidbek i njegov način rada</w:t>
+        <w:t>spravljeno u Radu za zbornik &amp; Master radu</w:t>
       </w:r>
     </w:p>
   </w:comment>
-  <w:comment w:id="19" w:author="Nikola Petrović" w:date="2026-10-06T12:16:00Z" w:initials="NP">
+  <w:comment w:id="19" w:author="Nikola Petrović" w:date="2026-10-06T11:24:00Z" w:initials="NP">
     <w:p>
       <w:pPr>
         <w:pStyle w:val="CommentText"/>
@@ -3745,11 +3831,11 @@
         <w:rPr>
           <w:lang w:val="sr-Latn-RS"/>
         </w:rPr>
-        <w:t xml:space="preserve">Nedostaje metoda obrade </w:t>
+        <w:t>Dodati sliku uređaja</w:t>
       </w:r>
     </w:p>
   </w:comment>
-  <w:comment w:id="20" w:author="Nikola Petrović" w:date="2026-10-06T11:31:00Z" w:initials="NP">
+  <w:comment w:id="20" w:author="Nikola Petrović" w:date="2026-10-06T11:24:00Z" w:initials="NP">
     <w:p>
       <w:pPr>
         <w:pStyle w:val="CommentText"/>
@@ -3766,11 +3852,11 @@
         <w:rPr>
           <w:lang w:val="sr-Latn-RS"/>
         </w:rPr>
-        <w:t>Približno je 46, 45.9 je tačna brojka. Ili napisati 46 ili još bolje, izbaciti reč "približno".</w:t>
+        <w:t>Dodati blok dijagram sistema</w:t>
       </w:r>
     </w:p>
   </w:comment>
-  <w:comment w:id="21" w:author="Nikola Petrović" w:date="2026-10-06T11:33:00Z" w:initials="NP">
+  <w:comment w:id="21" w:author="R2 15/2024 - Zarić Nada" w:date="2026-10-13T11:05:00Z" w:initials="NZ">
     <w:p>
       <w:pPr>
         <w:pStyle w:val="CommentText"/>
@@ -3785,13 +3871,164 @@
       </w:r>
       <w:r>
         <w:rPr>
+          <w:lang w:val="en-US"/>
+        </w:rPr>
+        <w:t>I</w:t>
+      </w:r>
+      <w:r>
+        <w:t xml:space="preserve">spravljeno u Radu za zbornik, </w:t>
+      </w:r>
+      <w:r>
+        <w:rPr>
+          <w:lang w:val="sr-Latn-BA"/>
+        </w:rPr>
+        <w:t>već postojalo u Master radu</w:t>
+      </w:r>
+    </w:p>
+    <w:p>
+      <w:pPr>
+        <w:pStyle w:val="CommentText"/>
+        <w:ind w:firstLine="0"/>
+        <w:jc w:val="left"/>
+      </w:pPr>
+    </w:p>
+  </w:comment>
+  <w:comment w:id="22" w:author="Nikola Petrović" w:date="2026-10-06T11:25:00Z" w:initials="NP">
+    <w:p>
+      <w:pPr>
+        <w:pStyle w:val="CommentText"/>
+        <w:ind w:firstLine="0"/>
+        <w:jc w:val="left"/>
+      </w:pPr>
+      <w:r>
+        <w:rPr>
+          <w:rStyle w:val="CommentReference"/>
+        </w:rPr>
+        <w:annotationRef/>
+      </w:r>
+      <w:r>
+        <w:rPr>
           <w:lang w:val="sr-Latn-RS"/>
         </w:rPr>
+        <w:t>Uzeti prikladniji termin</w:t>
+      </w:r>
+    </w:p>
+  </w:comment>
+  <w:comment w:id="23" w:author="Nikola Petrović" w:date="2026-10-06T12:15:00Z" w:initials="NP">
+    <w:p>
+      <w:pPr>
+        <w:pStyle w:val="CommentText"/>
+        <w:ind w:firstLine="0"/>
+        <w:jc w:val="left"/>
+      </w:pPr>
+      <w:r>
+        <w:rPr>
+          <w:rStyle w:val="CommentReference"/>
+        </w:rPr>
+        <w:annotationRef/>
+      </w:r>
+      <w:r>
+        <w:rPr>
+          <w:lang w:val="sr-Latn-RS"/>
+        </w:rPr>
+        <w:t>Preciznije opisati biofidbek i njegov način rada</w:t>
+      </w:r>
+    </w:p>
+  </w:comment>
+  <w:comment w:id="24" w:author="Nikola Petrović" w:date="2026-10-06T12:16:00Z" w:initials="NP">
+    <w:p>
+      <w:pPr>
+        <w:pStyle w:val="CommentText"/>
+        <w:ind w:firstLine="0"/>
+        <w:jc w:val="left"/>
+      </w:pPr>
+      <w:r>
+        <w:rPr>
+          <w:rStyle w:val="CommentReference"/>
+        </w:rPr>
+        <w:annotationRef/>
+      </w:r>
+      <w:r>
+        <w:rPr>
+          <w:lang w:val="sr-Latn-RS"/>
+        </w:rPr>
+        <w:t xml:space="preserve">Nedostaje metoda obrade </w:t>
+      </w:r>
+    </w:p>
+  </w:comment>
+  <w:comment w:id="25" w:author="R2 15/2024 - Zarić Nada" w:date="2026-10-13T11:05:00Z" w:initials="NZ">
+    <w:p>
+      <w:pPr>
+        <w:pStyle w:val="CommentText"/>
+        <w:ind w:firstLine="0"/>
+        <w:jc w:val="left"/>
+      </w:pPr>
+      <w:r>
+        <w:rPr>
+          <w:rStyle w:val="CommentReference"/>
+        </w:rPr>
+        <w:annotationRef/>
+      </w:r>
+      <w:r>
+        <w:rPr>
+          <w:lang w:val="en-US"/>
+        </w:rPr>
+        <w:t>I</w:t>
+      </w:r>
+      <w:r>
+        <w:t xml:space="preserve">spravljeno u Radu za zbornik, </w:t>
+      </w:r>
+      <w:r>
+        <w:rPr>
+          <w:lang w:val="sr-Latn-BA"/>
+        </w:rPr>
+        <w:t>već postojalo u Master radu</w:t>
+      </w:r>
+    </w:p>
+  </w:comment>
+  <w:comment w:id="26" w:author="Nikola Petrović" w:date="2026-10-06T11:31:00Z" w:initials="NP">
+    <w:p>
+      <w:pPr>
+        <w:pStyle w:val="CommentText"/>
+        <w:ind w:firstLine="0"/>
+        <w:jc w:val="left"/>
+      </w:pPr>
+      <w:r>
+        <w:rPr>
+          <w:rStyle w:val="CommentReference"/>
+        </w:rPr>
+        <w:annotationRef/>
+      </w:r>
+      <w:r>
+        <w:rPr>
+          <w:lang w:val="sr-Latn-RS"/>
+        </w:rPr>
+        <w:t>Približno je 46, 45.9 je tačna brojka. Ili napisati 46 ili još bolje, izbaciti reč "približno".</w:t>
+      </w:r>
+    </w:p>
+  </w:comment>
+  <w:comment w:id="27" w:author="Nikola Petrović" w:date="2026-10-06T11:33:00Z" w:initials="NP">
+    <w:p>
+      <w:pPr>
+        <w:pStyle w:val="CommentText"/>
+        <w:ind w:firstLine="0"/>
+        <w:jc w:val="left"/>
+      </w:pPr>
+      <w:r>
+        <w:rPr>
+          <w:rStyle w:val="CommentReference"/>
+        </w:rPr>
+        <w:annotationRef/>
+      </w:r>
+      <w:r>
+        <w:rPr>
+          <w:lang w:val="sr-Latn-RS"/>
+        </w:rPr>
         <w:t>U pravcima daljeg razvoja dodati nezavisno snimanje respiratornog signala. Za proveru tačnosti PPI intervala i njihovog odnosa sa srčanim intervalima, planirati poređenje sa referentnim EKG signalom</w:t>
       </w:r>
     </w:p>
   </w:comment>
-  <w:comment w:id="22" w:author="Nikola Petrović" w:date="2026-10-06T12:16:00Z" w:initials="NP">
+  <w:comment w:id="28" w:author="Nikola Petrović" w:date="2026-10-06T12:16:00Z" w:initials="NP">
     <w:p>
       <w:pPr>
         <w:pStyle w:val="CommentText"/>
@@ -3818,13 +4055,17 @@
 <file path=word/commentsExtended.xml><?xml version="1.0" encoding="utf-8"?>
 <w15:commentsEx xmlns:wpc="http://schemas.microsoft.com/office/word/2010/wordprocessingCanvas" xmlns:cx="http://schemas.microsoft.com/office/drawing/2014/chartex" xmlns:cx1="http://schemas.microsoft.com/office/drawing/2015/9/8/chartex" xmlns:cx2="http://schemas.microsoft.com/office/drawing/2015/10/21/chartex" xmlns:cx3="http://schemas.microsoft.com/office/drawing/2016/5/9/chartex" xmlns:cx4="http://schemas.microsoft.com/office/drawing/2016/5/10/chartex" xmlns:cx5="http://schemas.microsoft.com/office/drawing/2016/5/11/chartex" xmlns:cx6="http://schemas.microsoft.com/office/drawing/2016/5/12/chartex" xmlns:cx7="http://schemas.microsoft.com/office/drawing/2016/5/13/chartex" xmlns:cx8="http://schemas.microsoft.com/office/drawing/2016/5/14/chartex" xmlns:mc="http://schemas.openxmlformats.org/markup-compatibility/2006" xmlns:aink="http://schemas.microsoft.com/office/drawing/2016/ink" xmlns:am3d="http://schemas.microsoft.com/office/drawing/2017/model3d" xmlns:o="urn:schemas-microsoft-com:office:office" xmlns:oel="http://schemas.microsoft.com/office/2019/extlst" xmlns:r="http://schemas.openxmlformats.org/officeDocument/2006/relationships" xmlns:m="http://schemas.openxmlformats.org/officeDocument/2006/math" xmlns:v="urn:schemas-microsoft-com:vml" xmlns:wp14="http://schemas.microsoft.com/office/word/2010/wordprocessingDrawing" xmlns:wp="http://schemas.openxmlformats.org/drawingml/2006/wordprocessingDrawing" xmlns:w10="urn:schemas-microsoft-com:office:word" xmlns:w="http://schemas.openxmlformats.org/wordprocessingml/2006/main" xmlns:w14="http://schemas.microsoft.com/office/word/2010/wordml" xmlns:w15="http://schemas.microsoft.com/office/word/2012/wordml" xmlns:w16cex="http://schemas.microsoft.com/office/word/2018/wordml/cex" xmlns:w16cid="http://schemas.microsoft.com/office/word/2016/wordml/cid" xmlns:w16="http://schemas.microsoft.com/office/word/2018/wordml" xmlns:w16du="http://schemas.microsoft.com/office/word/2023/wordml/word16du" xmlns:w16sdtdh="http://schemas.microsoft.com/office/word/2020/wordml/sdtdatahash" xmlns:w16sdtfl="http://schemas.microsoft.com/office/word/2024/wordml/sdtformatlock" xmlns:w16se="http://schemas.microsoft.com/office/word/2015/wordml/symex" xmlns:wpg="http://schemas.microsoft.com/office/word/2010/wordprocessingGroup" xmlns:wpi="http://schemas.microsoft.com/office/word/2010/wordprocessingInk" xmlns:wne="http://schemas.microsoft.com/office/word/2006/wordml" xmlns:wps="http://schemas.microsoft.com/office/word/2010/wordprocessingShape" mc:Ignorable="w14 w15 w16se w16cid w16 w16cex w16sdtdh w16sdtfl w16du wp14">
   <w15:commentEx w15:paraId="1C291FE0" w15:done="1"/>
+  <w15:commentEx w15:paraId="1BFAAE69" w15:paraIdParent="1C291FE0" w15:done="1"/>
   <w15:commentEx w15:paraId="03154421" w15:done="1"/>
+  <w15:commentEx w15:paraId="6AEB6E23" w15:paraIdParent="03154421" w15:done="1"/>
   <w15:commentEx w15:paraId="22A68F2E" w15:done="1"/>
   <w15:commentEx w15:paraId="65250583" w15:paraIdParent="22A68F2E" w15:done="1"/>
   <w15:commentEx w15:paraId="2379D0B0" w15:done="1"/>
+  <w15:commentEx w15:paraId="4634854E" w15:paraIdParent="2379D0B0" w15:done="1"/>
   <w15:commentEx w15:paraId="7A2D839E" w15:done="1"/>
   <w15:commentEx w15:paraId="10580D75" w15:paraIdParent="7A2D839E" w15:done="1"/>
   <w15:commentEx w15:paraId="5D9EF95F" w15:done="1"/>
+  <w15:commentEx w15:paraId="4C8D4FDD" w15:paraIdParent="5D9EF95F" w15:done="1"/>
   <w15:commentEx w15:paraId="26D323AE" w15:done="1"/>
   <w15:commentEx w15:paraId="7F3D88DB" w15:done="1"/>
   <w15:commentEx w15:paraId="3D3FFC45" w15:done="1"/>
@@ -3834,9 +4075,11 @@
   <w15:commentEx w15:paraId="341382C3" w15:paraIdParent="77BEBC2D" w15:done="1"/>
   <w15:commentEx w15:paraId="16D7BFC2" w15:done="1"/>
   <w15:commentEx w15:paraId="5A6AD826" w15:done="1"/>
+  <w15:commentEx w15:paraId="1286960D" w15:paraIdParent="5A6AD826" w15:done="1"/>
   <w15:commentEx w15:paraId="13D3F450" w15:done="1"/>
   <w15:commentEx w15:paraId="302651A3" w15:done="1"/>
   <w15:commentEx w15:paraId="30C3EB6F" w15:done="1"/>
+  <w15:commentEx w15:paraId="359DFDFF" w15:paraIdParent="30C3EB6F" w15:done="1"/>
   <w15:commentEx w15:paraId="66FC94FF" w15:done="1"/>
   <w15:commentEx w15:paraId="69235226" w15:done="1"/>
   <w15:commentEx w15:paraId="5AB8006A" w15:done="1"/>
@@ -3858,6 +4101,7 @@
       </w16:ext>
     </w16cex:extLst>
   </w16cex:commentExtensible>
+  <w16cex:commentExtensible w16cex:durableId="07BB4B03" w16cex:dateUtc="2026-10-13T09:03:00Z"/>
   <w16cex:commentExtensible w16cex:durableId="22FC7F7A" w16cex:dateUtc="2026-10-06T10:18:00Z">
     <w16cex:extLst>
       <w16:ext w16:uri="{CE6994B0-6A32-4C9F-8C6B-6E91EDA988CE}">
@@ -3871,6 +4115,7 @@
       </w16:ext>
     </w16cex:extLst>
   </w16cex:commentExtensible>
+  <w16cex:commentExtensible w16cex:durableId="05727F89" w16cex:dateUtc="2026-10-13T09:03:00Z"/>
   <w16cex:commentExtensible w16cex:durableId="067F7B26" w16cex:dateUtc="2026-10-06T09:14:00Z">
     <w16cex:extLst>
       <w16:ext w16:uri="{CE6994B0-6A32-4C9F-8C6B-6E91EDA988CE}">
@@ -3885,7 +4130,20 @@
     </w16cex:extLst>
   </w16cex:commentExtensible>
   <w16cex:commentExtensible w16cex:durableId="6B4E43A9" w16cex:dateUtc="2026-10-08T12:47:00Z"/>
-  <w16cex:commentExtensible w16cex:durableId="61C5D911" w16cex:dateUtc="2026-10-06T09:16:00Z"/>
+  <w16cex:commentExtensible w16cex:durableId="61C5D911" w16cex:dateUtc="2026-10-06T09:16:00Z">
+    <w16cex:extLst>
+      <w16:ext w16:uri="{CE6994B0-6A32-4C9F-8C6B-6E91EDA988CE}">
+        <cr:reactions xmlns:cr="http://schemas.microsoft.com/office/comments/2020/reactions">
+          <cr:reaction reactionType="1">
+            <cr:reactionInfo dateUtc="2026-10-13T09:02:30Z">
+              <cr:user userId="S::zaric.r215.2024@uns.ac.rs::376d53b1-556f-4201-b587-07a1f5b3a0f0" userProvider="AD" userName="R2 15/2024 - Zarić Nada"/>
+            </cr:reactionInfo>
+          </cr:reaction>
+        </cr:reactions>
+      </w16:ext>
+    </w16cex:extLst>
+  </w16cex:commentExtensible>
+  <w16cex:commentExtensible w16cex:durableId="3AA23B24" w16cex:dateUtc="2026-10-13T09:03:00Z"/>
   <w16cex:commentExtensible w16cex:durableId="47134FA7" w16cex:dateUtc="2026-10-06T09:17:00Z">
     <w16cex:extLst>
       <w16:ext w16:uri="{CE6994B0-6A32-4C9F-8C6B-6E91EDA988CE}">
@@ -3913,6 +4171,7 @@
       </w16:ext>
     </w16cex:extLst>
   </w16cex:commentExtensible>
+  <w16cex:commentExtensible w16cex:durableId="6CC5BBAB" w16cex:dateUtc="2026-10-13T09:04:00Z"/>
   <w16cex:commentExtensible w16cex:durableId="1962213A" w16cex:dateUtc="2026-10-06T09:18:00Z"/>
   <w16cex:commentExtensible w16cex:durableId="22448D34" w16cex:dateUtc="2026-10-06T09:19:00Z"/>
   <w16cex:commentExtensible w16cex:durableId="5489091F" w16cex:dateUtc="2026-10-06T09:19:00Z"/>
@@ -3945,10 +4204,36 @@
   </w16cex:commentExtensible>
   <w16cex:commentExtensible w16cex:durableId="02FC3722" w16cex:dateUtc="2026-10-08T13:20:00Z"/>
   <w16cex:commentExtensible w16cex:durableId="7039A8C7" w16cex:dateUtc="2026-10-06T09:24:00Z"/>
-  <w16cex:commentExtensible w16cex:durableId="17A202FA" w16cex:dateUtc="2026-10-06T09:24:00Z"/>
+  <w16cex:commentExtensible w16cex:durableId="17A202FA" w16cex:dateUtc="2026-10-06T09:24:00Z">
+    <w16cex:extLst>
+      <w16:ext w16:uri="{CE6994B0-6A32-4C9F-8C6B-6E91EDA988CE}">
+        <cr:reactions xmlns:cr="http://schemas.microsoft.com/office/comments/2020/reactions">
+          <cr:reaction reactionType="1">
+            <cr:reactionInfo dateUtc="2026-10-13T07:45:28Z">
+              <cr:user userId="S::zaric.r215.2024@uns.ac.rs::376d53b1-556f-4201-b587-07a1f5b3a0f0" userProvider="AD" userName="R2 15/2024 - Zarić Nada"/>
+            </cr:reactionInfo>
+          </cr:reaction>
+        </cr:reactions>
+      </w16:ext>
+    </w16cex:extLst>
+  </w16cex:commentExtensible>
+  <w16cex:commentExtensible w16cex:durableId="31567101" w16cex:dateUtc="2026-10-13T09:05:00Z"/>
   <w16cex:commentExtensible w16cex:durableId="0CA20FCF" w16cex:dateUtc="2026-10-06T09:25:00Z"/>
   <w16cex:commentExtensible w16cex:durableId="68661C5A" w16cex:dateUtc="2026-10-06T10:15:00Z"/>
-  <w16cex:commentExtensible w16cex:durableId="6702BF47" w16cex:dateUtc="2026-10-06T10:16:00Z"/>
+  <w16cex:commentExtensible w16cex:durableId="6702BF47" w16cex:dateUtc="2026-10-06T10:16:00Z">
+    <w16cex:extLst>
+      <w16:ext w16:uri="{CE6994B0-6A32-4C9F-8C6B-6E91EDA988CE}">
+        <cr:reactions xmlns:cr="http://schemas.microsoft.com/office/comments/2020/reactions">
+          <cr:reaction reactionType="1">
+            <cr:reactionInfo dateUtc="2026-10-13T07:45:46Z">
+              <cr:user userId="S::zaric.r215.2024@uns.ac.rs::376d53b1-556f-4201-b587-07a1f5b3a0f0" userProvider="AD" userName="R2 15/2024 - Zarić Nada"/>
+            </cr:reactionInfo>
+          </cr:reaction>
+        </cr:reactions>
+      </w16:ext>
+    </w16cex:extLst>
+  </w16cex:commentExtensible>
+  <w16cex:commentExtensible w16cex:durableId="2FA53135" w16cex:dateUtc="2026-10-13T09:05:00Z"/>
   <w16cex:commentExtensible w16cex:durableId="5146845C" w16cex:dateUtc="2026-10-06T09:31:00Z"/>
   <w16cex:commentExtensible w16cex:durableId="3AABA9EB" w16cex:dateUtc="2026-10-06T09:33:00Z"/>
   <w16cex:commentExtensible w16cex:durableId="7767BD94" w16cex:dateUtc="2026-10-06T10:16:00Z"/>
@@ -3958,13 +4243,17 @@
 <file path=word/commentsIds.xml><?xml version="1.0" encoding="utf-8"?>
 <w16cid:commentsIds xmlns:wpc="http://schemas.microsoft.com/office/word/2010/wordprocessingCanvas" xmlns:cx="http://schemas.microsoft.com/office/drawing/2014/chartex" xmlns:cx1="http://schemas.microsoft.com/office/drawing/2015/9/8/chartex" xmlns:cx2="http://schemas.microsoft.com/office/drawing/2015/10/21/chartex" xmlns:cx3="http://schemas.microsoft.com/office/drawing/2016/5/9/chartex" xmlns:cx4="http://schemas.microsoft.com/office/drawing/2016/5/10/chartex" xmlns:cx5="http://schemas.microsoft.com/office/drawing/2016/5/11/chartex" xmlns:cx6="http://schemas.microsoft.com/office/drawing/2016/5/12/chartex" xmlns:cx7="http://schemas.microsoft.com/office/drawing/2016/5/13/chartex" xmlns:cx8="http://schemas.microsoft.com/office/drawing/2016/5/14/chartex" xmlns:mc="http://schemas.openxmlformats.org/markup-compatibility/2006" xmlns:aink="http://schemas.microsoft.com/office/drawing/2016/ink" xmlns:am3d="http://schemas.microsoft.com/office/drawing/2017/model3d" xmlns:o="urn:schemas-microsoft-com:office:office" xmlns:oel="http://schemas.microsoft.com/office/2019/extlst" xmlns:r="http://schemas.openxmlformats.org/officeDocument/2006/relationships" xmlns:m="http://schemas.openxmlformats.org/officeDocument/2006/math" xmlns:v="urn:schemas-microsoft-com:vml" xmlns:wp14="http://schemas.microsoft.com/office/word/2010/wordprocessingDrawing" xmlns:wp="http://schemas.openxmlformats.org/drawingml/2006/wordprocessingDrawing" xmlns:w10="urn:schemas-microsoft-com:office:word" xmlns:w="http://schemas.openxmlformats.org/wordprocessingml/2006/main" xmlns:w14="http://schemas.microsoft.com/office/word/2010/wordml" xmlns:w15="http://schemas.microsoft.com/office/word/2012/wordml" xmlns:w16cex="http://schemas.microsoft.com/office/word/2018/wordml/cex" xmlns:w16cid="http://schemas.microsoft.com/office/word/2016/wordml/cid" xmlns:w16="http://schemas.microsoft.com/office/word/2018/wordml" xmlns:w16du="http://schemas.microsoft.com/office/word/2023/wordml/word16du" xmlns:w16sdtdh="http://schemas.microsoft.com/office/word/2020/wordml/sdtdatahash" xmlns:w16sdtfl="http://schemas.microsoft.com/office/word/2024/wordml/sdtformatlock" xmlns:w16se="http://schemas.microsoft.com/office/word/2015/wordml/symex" xmlns:wpg="http://schemas.microsoft.com/office/word/2010/wordprocessingGroup" xmlns:wpi="http://schemas.microsoft.com/office/word/2010/wordprocessingInk" xmlns:wne="http://schemas.microsoft.com/office/word/2006/wordml" xmlns:wps="http://schemas.microsoft.com/office/word/2010/wordprocessingShape" mc:Ignorable="w14 w15 w16se w16cid w16 w16cex w16sdtdh w16sdtfl w16du wp14">
   <w16cid:commentId w16cid:paraId="1C291FE0" w16cid:durableId="3D46F092"/>
+  <w16cid:commentId w16cid:paraId="1BFAAE69" w16cid:durableId="07BB4B03"/>
   <w16cid:commentId w16cid:paraId="03154421" w16cid:durableId="22FC7F7A"/>
+  <w16cid:commentId w16cid:paraId="6AEB6E23" w16cid:durableId="05727F89"/>
   <w16cid:commentId w16cid:paraId="22A68F2E" w16cid:durableId="067F7B26"/>
   <w16cid:commentId w16cid:paraId="65250583" w16cid:durableId="6B4E43A9"/>
   <w16cid:commentId w16cid:paraId="2379D0B0" w16cid:durableId="61C5D911"/>
+  <w16cid:commentId w16cid:paraId="4634854E" w16cid:durableId="3AA23B24"/>
   <w16cid:commentId w16cid:paraId="7A2D839E" w16cid:durableId="47134FA7"/>
   <w16cid:commentId w16cid:paraId="10580D75" w16cid:durableId="0F8F20D9"/>
   <w16cid:commentId w16cid:paraId="5D9EF95F" w16cid:durableId="6AD66D66"/>
+  <w16cid:commentId w16cid:paraId="4C8D4FDD" w16cid:durableId="6CC5BBAB"/>
   <w16cid:commentId w16cid:paraId="26D323AE" w16cid:durableId="1962213A"/>
   <w16cid:commentId w16cid:paraId="7F3D88DB" w16cid:durableId="22448D34"/>
   <w16cid:commentId w16cid:paraId="3D3FFC45" w16cid:durableId="5489091F"/>
@@ -3974,9 +4263,11 @@
   <w16cid:commentId w16cid:paraId="341382C3" w16cid:durableId="02FC3722"/>
   <w16cid:commentId w16cid:paraId="16D7BFC2" w16cid:durableId="7039A8C7"/>
   <w16cid:commentId w16cid:paraId="5A6AD826" w16cid:durableId="17A202FA"/>
+  <w16cid:commentId w16cid:paraId="1286960D" w16cid:durableId="31567101"/>
   <w16cid:commentId w16cid:paraId="13D3F450" w16cid:durableId="0CA20FCF"/>
   <w16cid:commentId w16cid:paraId="302651A3" w16cid:durableId="68661C5A"/>
   <w16cid:commentId w16cid:paraId="30C3EB6F" w16cid:durableId="6702BF47"/>
+  <w16cid:commentId w16cid:paraId="359DFDFF" w16cid:durableId="2FA53135"/>
   <w16cid:commentId w16cid:paraId="66FC94FF" w16cid:durableId="5146845C"/>
   <w16cid:commentId w16cid:paraId="69235226" w16cid:durableId="3AABA9EB"/>
   <w16cid:commentId w16cid:paraId="5AB8006A" w16cid:durableId="7767BD94"/>

</xml_diff>

<commit_message>
Uskladjivanje rezultata i zakljucka
</commit_message>
<xml_diff>
--- a/radovi/NadaZaric_R215_RadZaZbornik_v1_Komentari.docx
+++ b/radovi/NadaZaric_R215_RadZaZbornik_v1_Komentari.docx
@@ -2595,6 +2595,7 @@
         <w:t xml:space="preserve">2 била је </w:t>
       </w:r>
       <w:commentRangeStart w:id="31"/>
+      <w:commentRangeStart w:id="32"/>
       <w:r>
         <w:rPr>
           <w:lang w:val="ru-RU"/>
@@ -2610,6 +2611,16 @@
           <w:lang w:val="ru-RU"/>
         </w:rPr>
         <w:commentReference w:id="31"/>
+      </w:r>
+      <w:commentRangeEnd w:id="32"/>
+      <w:r>
+        <w:rPr>
+          <w:rStyle w:val="CommentReference"/>
+          <w:sz w:val="20"/>
+          <w:szCs w:val="22"/>
+          <w:lang w:val="ru-RU"/>
+        </w:rPr>
+        <w:commentReference w:id="32"/>
       </w:r>
       <w:r>
         <w:rPr>
@@ -2803,18 +2814,28 @@
       <w:pPr>
         <w:pStyle w:val="1-"/>
       </w:pPr>
-      <w:commentRangeStart w:id="32"/>
+      <w:commentRangeStart w:id="33"/>
+      <w:commentRangeStart w:id="34"/>
       <w:r>
         <w:t>ЗАКЉУЧАК</w:t>
       </w:r>
-      <w:commentRangeEnd w:id="32"/>
+      <w:commentRangeEnd w:id="33"/>
       <w:r>
         <w:rPr>
           <w:rStyle w:val="CommentReference"/>
           <w:sz w:val="20"/>
           <w:szCs w:val="20"/>
         </w:rPr>
-        <w:commentReference w:id="32"/>
+        <w:commentReference w:id="33"/>
+      </w:r>
+      <w:commentRangeEnd w:id="34"/>
+      <w:r>
+        <w:rPr>
+          <w:rStyle w:val="CommentReference"/>
+          <w:sz w:val="20"/>
+          <w:szCs w:val="20"/>
+        </w:rPr>
+        <w:commentReference w:id="34"/>
       </w:r>
     </w:p>
     <w:p>
@@ -2824,18 +2845,28 @@
       <w:r>
         <w:t xml:space="preserve">У раду је реализован систем за праћење физиолошких параметара заснован на паметном сату и мобилном телефону, који омогућава прикупљање и обраду PPG сигнала и извођење вођеног дисања уз биолошку повратну информацију. Резултати су показали да током вођеног дисања </w:t>
       </w:r>
-      <w:commentRangeStart w:id="33"/>
+      <w:commentRangeStart w:id="35"/>
+      <w:commentRangeStart w:id="36"/>
       <w:r>
         <w:t xml:space="preserve">није дошло </w:t>
       </w:r>
-      <w:commentRangeEnd w:id="33"/>
+      <w:commentRangeEnd w:id="35"/>
       <w:r>
         <w:rPr>
           <w:rStyle w:val="CommentReference"/>
           <w:sz w:val="20"/>
           <w:szCs w:val="22"/>
         </w:rPr>
-        <w:commentReference w:id="33"/>
+        <w:commentReference w:id="35"/>
+      </w:r>
+      <w:commentRangeEnd w:id="36"/>
+      <w:r>
+        <w:rPr>
+          <w:rStyle w:val="CommentReference"/>
+          <w:sz w:val="20"/>
+          <w:szCs w:val="22"/>
+        </w:rPr>
+        <w:commentReference w:id="36"/>
       </w:r>
       <w:r>
         <w:t xml:space="preserve">до изражене промјене просјечне фреквенције пулса, али су уочене већа варијабилност пулсних интервала и израженије периодичне промјене срчане активности. Тиме је у </w:t>
@@ -4150,7 +4181,7 @@
       </w:r>
     </w:p>
   </w:comment>
-  <w:comment w:id="32" w:author="Nikola Petrović" w:date="2026-10-06T11:33:00Z" w:initials="NP">
+  <w:comment w:id="32" w:author="R2 15/2024 - Zarić Nada" w:date="2026-10-13T13:32:00Z" w:initials="NZ">
     <w:p>
       <w:pPr>
         <w:pStyle w:val="CommentText"/>
@@ -4164,14 +4195,11 @@
         <w:annotationRef/>
       </w:r>
       <w:r>
-        <w:rPr>
-          <w:lang w:val="sr-Latn-RS"/>
-        </w:rPr>
-        <w:t>U pravcima daljeg razvoja dodati nezavisno snimanje respiratornog signala. Za proveru tačnosti PPI intervala i njihovog odnosa sa srčanim intervalima, planirati poređenje sa referentnim EKG signalom</w:t>
+        <w:t>Ispravljeno u Radu za zbornik &amp; Master radu</w:t>
       </w:r>
     </w:p>
   </w:comment>
-  <w:comment w:id="33" w:author="Nikola Petrović" w:date="2026-10-06T12:16:00Z" w:initials="NP">
+  <w:comment w:id="33" w:author="Nikola Petrović" w:date="2026-10-06T11:33:00Z" w:initials="NP">
     <w:p>
       <w:pPr>
         <w:pStyle w:val="CommentText"/>
@@ -4188,7 +4216,64 @@
         <w:rPr>
           <w:lang w:val="sr-Latn-RS"/>
         </w:rPr>
+        <w:t>U pravcima daljeg razvoja dodati nezavisno snimanje respiratornog signala. Za proveru tačnosti PPI intervala i njihovog odnosa sa srčanim intervalima, planirati poređenje sa referentnim EKG signalom</w:t>
+      </w:r>
+    </w:p>
+  </w:comment>
+  <w:comment w:id="34" w:author="R2 15/2024 - Zarić Nada" w:date="2026-10-13T13:32:00Z" w:initials="NZ">
+    <w:p>
+      <w:pPr>
+        <w:pStyle w:val="CommentText"/>
+        <w:ind w:firstLine="0"/>
+        <w:jc w:val="left"/>
+      </w:pPr>
+      <w:r>
+        <w:rPr>
+          <w:rStyle w:val="CommentReference"/>
+        </w:rPr>
+        <w:annotationRef/>
+      </w:r>
+      <w:r>
+        <w:t>Ispravljeno u Radu za zbornik &amp; Master radu</w:t>
+      </w:r>
+    </w:p>
+  </w:comment>
+  <w:comment w:id="35" w:author="Nikola Petrović" w:date="2026-10-06T12:16:00Z" w:initials="NP">
+    <w:p>
+      <w:pPr>
+        <w:pStyle w:val="CommentText"/>
+        <w:ind w:firstLine="0"/>
+        <w:jc w:val="left"/>
+      </w:pPr>
+      <w:r>
+        <w:rPr>
+          <w:rStyle w:val="CommentReference"/>
+        </w:rPr>
+        <w:annotationRef/>
+      </w:r>
+      <w:r>
+        <w:rPr>
+          <w:lang w:val="sr-Latn-RS"/>
+        </w:rPr>
         <w:t>Napisati konkretnije</w:t>
+      </w:r>
+    </w:p>
+  </w:comment>
+  <w:comment w:id="36" w:author="R2 15/2024 - Zarić Nada" w:date="2026-10-13T13:32:00Z" w:initials="NZ">
+    <w:p>
+      <w:pPr>
+        <w:pStyle w:val="CommentText"/>
+        <w:ind w:firstLine="0"/>
+        <w:jc w:val="left"/>
+      </w:pPr>
+      <w:r>
+        <w:rPr>
+          <w:rStyle w:val="CommentReference"/>
+        </w:rPr>
+        <w:annotationRef/>
+      </w:r>
+      <w:r>
+        <w:t>Ispravljeno u Radu za zbornik &amp; Master radu</w:t>
       </w:r>
     </w:p>
   </w:comment>
@@ -4229,8 +4314,11 @@
   <w15:commentEx w15:paraId="30C3EB6F" w15:done="1"/>
   <w15:commentEx w15:paraId="359DFDFF" w15:paraIdParent="30C3EB6F" w15:done="1"/>
   <w15:commentEx w15:paraId="66FC94FF" w15:done="1"/>
+  <w15:commentEx w15:paraId="64B9D96B" w15:paraIdParent="66FC94FF" w15:done="1"/>
   <w15:commentEx w15:paraId="69235226" w15:done="1"/>
+  <w15:commentEx w15:paraId="56A09823" w15:paraIdParent="69235226" w15:done="1"/>
   <w15:commentEx w15:paraId="5AB8006A" w15:done="1"/>
+  <w15:commentEx w15:paraId="1CB265D1" w15:paraIdParent="5AB8006A" w15:done="1"/>
 </w15:commentsEx>
 </file>
 
@@ -4447,9 +4535,48 @@
     </w16cex:extLst>
   </w16cex:commentExtensible>
   <w16cex:commentExtensible w16cex:durableId="2FA53135" w16cex:dateUtc="2026-10-13T09:05:00Z"/>
-  <w16cex:commentExtensible w16cex:durableId="5146845C" w16cex:dateUtc="2026-10-06T09:31:00Z"/>
-  <w16cex:commentExtensible w16cex:durableId="3AABA9EB" w16cex:dateUtc="2026-10-06T09:33:00Z"/>
-  <w16cex:commentExtensible w16cex:durableId="7767BD94" w16cex:dateUtc="2026-10-06T10:16:00Z"/>
+  <w16cex:commentExtensible w16cex:durableId="5146845C" w16cex:dateUtc="2026-10-06T09:31:00Z">
+    <w16cex:extLst>
+      <w16:ext w16:uri="{CE6994B0-6A32-4C9F-8C6B-6E91EDA988CE}">
+        <cr:reactions xmlns:cr="http://schemas.microsoft.com/office/comments/2020/reactions">
+          <cr:reaction reactionType="1">
+            <cr:reactionInfo dateUtc="2026-10-13T11:32:36Z">
+              <cr:user userId="S::zaric.r215.2024@uns.ac.rs::376d53b1-556f-4201-b587-07a1f5b3a0f0" userProvider="AD" userName="R2 15/2024 - Zarić Nada"/>
+            </cr:reactionInfo>
+          </cr:reaction>
+        </cr:reactions>
+      </w16:ext>
+    </w16cex:extLst>
+  </w16cex:commentExtensible>
+  <w16cex:commentExtensible w16cex:durableId="2B0AA706" w16cex:dateUtc="2026-10-13T11:32:00Z"/>
+  <w16cex:commentExtensible w16cex:durableId="3AABA9EB" w16cex:dateUtc="2026-10-06T09:33:00Z">
+    <w16cex:extLst>
+      <w16:ext w16:uri="{CE6994B0-6A32-4C9F-8C6B-6E91EDA988CE}">
+        <cr:reactions xmlns:cr="http://schemas.microsoft.com/office/comments/2020/reactions">
+          <cr:reaction reactionType="1">
+            <cr:reactionInfo dateUtc="2026-10-13T11:32:04Z">
+              <cr:user userId="S::zaric.r215.2024@uns.ac.rs::376d53b1-556f-4201-b587-07a1f5b3a0f0" userProvider="AD" userName="R2 15/2024 - Zarić Nada"/>
+            </cr:reactionInfo>
+          </cr:reaction>
+        </cr:reactions>
+      </w16:ext>
+    </w16cex:extLst>
+  </w16cex:commentExtensible>
+  <w16cex:commentExtensible w16cex:durableId="1B13EBC4" w16cex:dateUtc="2026-10-13T11:32:00Z"/>
+  <w16cex:commentExtensible w16cex:durableId="7767BD94" w16cex:dateUtc="2026-10-06T10:16:00Z">
+    <w16cex:extLst>
+      <w16:ext w16:uri="{CE6994B0-6A32-4C9F-8C6B-6E91EDA988CE}">
+        <cr:reactions xmlns:cr="http://schemas.microsoft.com/office/comments/2020/reactions">
+          <cr:reaction reactionType="1">
+            <cr:reactionInfo dateUtc="2026-10-13T11:32:14Z">
+              <cr:user userId="S::zaric.r215.2024@uns.ac.rs::376d53b1-556f-4201-b587-07a1f5b3a0f0" userProvider="AD" userName="R2 15/2024 - Zarić Nada"/>
+            </cr:reactionInfo>
+          </cr:reaction>
+        </cr:reactions>
+      </w16:ext>
+    </w16cex:extLst>
+  </w16cex:commentExtensible>
+  <w16cex:commentExtensible w16cex:durableId="578EEAE6" w16cex:dateUtc="2026-10-13T11:32:00Z"/>
 </w16cex:commentsExtensible>
 </file>
 
@@ -4487,8 +4614,11 @@
   <w16cid:commentId w16cid:paraId="30C3EB6F" w16cid:durableId="6702BF47"/>
   <w16cid:commentId w16cid:paraId="359DFDFF" w16cid:durableId="2FA53135"/>
   <w16cid:commentId w16cid:paraId="66FC94FF" w16cid:durableId="5146845C"/>
+  <w16cid:commentId w16cid:paraId="64B9D96B" w16cid:durableId="2B0AA706"/>
   <w16cid:commentId w16cid:paraId="69235226" w16cid:durableId="3AABA9EB"/>
+  <w16cid:commentId w16cid:paraId="56A09823" w16cid:durableId="1B13EBC4"/>
   <w16cid:commentId w16cid:paraId="5AB8006A" w16cid:durableId="7767BD94"/>
+  <w16cid:commentId w16cid:paraId="1CB265D1" w16cid:durableId="578EEAE6"/>
 </w16cid:commentsIds>
 </file>
 

</xml_diff>